<commit_message>
made the first iteration of system, using a premade list of words and a simple linear checker to see if a word exists from that file
</commit_message>
<xml_diff>
--- a/project_writeup/Project Research Notes.docx
+++ b/project_writeup/Project Research Notes.docx
@@ -156,6 +156,153 @@
           <w:bCs/>
         </w:rPr>
       </w:pPr>
+      <w:r>
+        <w:rPr>
+          <w:b/>
+          <w:bCs/>
+        </w:rPr>
+        <w:t>Tree Traversal algorithms:</w:t>
+      </w:r>
+    </w:p>
+    <w:p>
+      <w:pPr>
+        <w:pStyle w:val="ListParagraph"/>
+        <w:numPr>
+          <w:ilvl w:val="0"/>
+          <w:numId w:val="3"/>
+        </w:numPr>
+        <w:rPr>
+          <w:b/>
+          <w:bCs/>
+        </w:rPr>
+      </w:pPr>
+      <w:r>
+        <w:rPr>
+          <w:b/>
+          <w:bCs/>
+        </w:rPr>
+        <w:t>DFS</w:t>
+      </w:r>
+    </w:p>
+    <w:p>
+      <w:pPr>
+        <w:pStyle w:val="ListParagraph"/>
+        <w:numPr>
+          <w:ilvl w:val="1"/>
+          <w:numId w:val="3"/>
+        </w:numPr>
+        <w:rPr>
+          <w:b/>
+          <w:bCs/>
+        </w:rPr>
+      </w:pPr>
+      <w:r>
+        <w:rPr>
+          <w:b/>
+          <w:bCs/>
+        </w:rPr>
+        <w:t>Inorder</w:t>
+      </w:r>
+    </w:p>
+    <w:p>
+      <w:pPr>
+        <w:pStyle w:val="ListParagraph"/>
+        <w:numPr>
+          <w:ilvl w:val="1"/>
+          <w:numId w:val="3"/>
+        </w:numPr>
+        <w:rPr>
+          <w:b/>
+          <w:bCs/>
+        </w:rPr>
+      </w:pPr>
+      <w:r>
+        <w:rPr>
+          <w:b/>
+          <w:bCs/>
+        </w:rPr>
+        <w:t>Preorder</w:t>
+      </w:r>
+    </w:p>
+    <w:p>
+      <w:pPr>
+        <w:pStyle w:val="ListParagraph"/>
+        <w:numPr>
+          <w:ilvl w:val="1"/>
+          <w:numId w:val="3"/>
+        </w:numPr>
+        <w:rPr>
+          <w:b/>
+          <w:bCs/>
+        </w:rPr>
+      </w:pPr>
+      <w:r>
+        <w:rPr>
+          <w:b/>
+          <w:bCs/>
+        </w:rPr>
+        <w:t>Postorder</w:t>
+      </w:r>
+    </w:p>
+    <w:p>
+      <w:pPr>
+        <w:pStyle w:val="ListParagraph"/>
+        <w:numPr>
+          <w:ilvl w:val="0"/>
+          <w:numId w:val="3"/>
+        </w:numPr>
+        <w:rPr>
+          <w:b/>
+          <w:bCs/>
+        </w:rPr>
+      </w:pPr>
+      <w:r>
+        <w:rPr>
+          <w:b/>
+          <w:bCs/>
+        </w:rPr>
+        <w:t>BFS</w:t>
+      </w:r>
+    </w:p>
+    <w:p>
+      <w:pPr>
+        <w:pStyle w:val="ListParagraph"/>
+        <w:numPr>
+          <w:ilvl w:val="0"/>
+          <w:numId w:val="3"/>
+        </w:numPr>
+        <w:rPr>
+          <w:b/>
+          <w:bCs/>
+        </w:rPr>
+      </w:pPr>
+      <w:r>
+        <w:rPr>
+          <w:b/>
+          <w:bCs/>
+        </w:rPr>
+        <w:t>Boundary Traversal</w:t>
+      </w:r>
+    </w:p>
+    <w:p>
+      <w:pPr>
+        <w:pStyle w:val="ListParagraph"/>
+        <w:numPr>
+          <w:ilvl w:val="0"/>
+          <w:numId w:val="3"/>
+        </w:numPr>
+        <w:rPr>
+          <w:b/>
+          <w:bCs/>
+        </w:rPr>
+      </w:pPr>
+      <w:r>
+        <w:rPr>
+          <w:b/>
+          <w:bCs/>
+        </w:rPr>
+        <w:t>Diagonal Traversal</w:t>
+      </w:r>
     </w:p>
     <w:p>
       <w:pPr>
@@ -412,11 +559,127 @@
       </w:rPr>
     </w:lvl>
   </w:abstractNum>
+  <w:abstractNum w:abstractNumId="2" w15:restartNumberingAfterBreak="0">
+    <w:nsid w:val="560240BD"/>
+    <w:multiLevelType w:val="hybridMultilevel"/>
+    <w:tmpl w:val="AEAA2C7A"/>
+    <w:lvl w:ilvl="0" w:tplc="08090001">
+      <w:start w:val="1"/>
+      <w:numFmt w:val="bullet"/>
+      <w:lvlText w:val=""/>
+      <w:lvlJc w:val="left"/>
+      <w:pPr>
+        <w:ind w:left="720" w:hanging="360"/>
+      </w:pPr>
+      <w:rPr>
+        <w:rFonts w:ascii="Symbol" w:hAnsi="Symbol" w:hint="default"/>
+      </w:rPr>
+    </w:lvl>
+    <w:lvl w:ilvl="1" w:tplc="08090003">
+      <w:start w:val="1"/>
+      <w:numFmt w:val="bullet"/>
+      <w:lvlText w:val="o"/>
+      <w:lvlJc w:val="left"/>
+      <w:pPr>
+        <w:ind w:left="1440" w:hanging="360"/>
+      </w:pPr>
+      <w:rPr>
+        <w:rFonts w:ascii="Courier New" w:hAnsi="Courier New" w:cs="Courier New" w:hint="default"/>
+      </w:rPr>
+    </w:lvl>
+    <w:lvl w:ilvl="2" w:tplc="08090005" w:tentative="1">
+      <w:start w:val="1"/>
+      <w:numFmt w:val="bullet"/>
+      <w:lvlText w:val=""/>
+      <w:lvlJc w:val="left"/>
+      <w:pPr>
+        <w:ind w:left="2160" w:hanging="360"/>
+      </w:pPr>
+      <w:rPr>
+        <w:rFonts w:ascii="Wingdings" w:hAnsi="Wingdings" w:hint="default"/>
+      </w:rPr>
+    </w:lvl>
+    <w:lvl w:ilvl="3" w:tplc="08090001" w:tentative="1">
+      <w:start w:val="1"/>
+      <w:numFmt w:val="bullet"/>
+      <w:lvlText w:val=""/>
+      <w:lvlJc w:val="left"/>
+      <w:pPr>
+        <w:ind w:left="2880" w:hanging="360"/>
+      </w:pPr>
+      <w:rPr>
+        <w:rFonts w:ascii="Symbol" w:hAnsi="Symbol" w:hint="default"/>
+      </w:rPr>
+    </w:lvl>
+    <w:lvl w:ilvl="4" w:tplc="08090003" w:tentative="1">
+      <w:start w:val="1"/>
+      <w:numFmt w:val="bullet"/>
+      <w:lvlText w:val="o"/>
+      <w:lvlJc w:val="left"/>
+      <w:pPr>
+        <w:ind w:left="3600" w:hanging="360"/>
+      </w:pPr>
+      <w:rPr>
+        <w:rFonts w:ascii="Courier New" w:hAnsi="Courier New" w:cs="Courier New" w:hint="default"/>
+      </w:rPr>
+    </w:lvl>
+    <w:lvl w:ilvl="5" w:tplc="08090005" w:tentative="1">
+      <w:start w:val="1"/>
+      <w:numFmt w:val="bullet"/>
+      <w:lvlText w:val=""/>
+      <w:lvlJc w:val="left"/>
+      <w:pPr>
+        <w:ind w:left="4320" w:hanging="360"/>
+      </w:pPr>
+      <w:rPr>
+        <w:rFonts w:ascii="Wingdings" w:hAnsi="Wingdings" w:hint="default"/>
+      </w:rPr>
+    </w:lvl>
+    <w:lvl w:ilvl="6" w:tplc="08090001" w:tentative="1">
+      <w:start w:val="1"/>
+      <w:numFmt w:val="bullet"/>
+      <w:lvlText w:val=""/>
+      <w:lvlJc w:val="left"/>
+      <w:pPr>
+        <w:ind w:left="5040" w:hanging="360"/>
+      </w:pPr>
+      <w:rPr>
+        <w:rFonts w:ascii="Symbol" w:hAnsi="Symbol" w:hint="default"/>
+      </w:rPr>
+    </w:lvl>
+    <w:lvl w:ilvl="7" w:tplc="08090003" w:tentative="1">
+      <w:start w:val="1"/>
+      <w:numFmt w:val="bullet"/>
+      <w:lvlText w:val="o"/>
+      <w:lvlJc w:val="left"/>
+      <w:pPr>
+        <w:ind w:left="5760" w:hanging="360"/>
+      </w:pPr>
+      <w:rPr>
+        <w:rFonts w:ascii="Courier New" w:hAnsi="Courier New" w:cs="Courier New" w:hint="default"/>
+      </w:rPr>
+    </w:lvl>
+    <w:lvl w:ilvl="8" w:tplc="08090005" w:tentative="1">
+      <w:start w:val="1"/>
+      <w:numFmt w:val="bullet"/>
+      <w:lvlText w:val=""/>
+      <w:lvlJc w:val="left"/>
+      <w:pPr>
+        <w:ind w:left="6480" w:hanging="360"/>
+      </w:pPr>
+      <w:rPr>
+        <w:rFonts w:ascii="Wingdings" w:hAnsi="Wingdings" w:hint="default"/>
+      </w:rPr>
+    </w:lvl>
+  </w:abstractNum>
   <w:num w:numId="1" w16cid:durableId="895553513">
     <w:abstractNumId w:val="0"/>
   </w:num>
   <w:num w:numId="2" w16cid:durableId="999772272">
     <w:abstractNumId w:val="1"/>
+  </w:num>
+  <w:num w:numId="3" w16cid:durableId="1869642298">
+    <w:abstractNumId w:val="2"/>
   </w:num>
 </w:numbering>
 </file>

</xml_diff>